<commit_message>
Update the research paper; type setting issues
Add a pdf version of the file
</commit_message>
<xml_diff>
--- a/Research paper.docx
+++ b/Research paper.docx
@@ -1,6 +1,6 @@
 
 <file path=word/document.xml><?xml version="1.0" encoding="utf-8"?>
-<w:document xmlns:wpc="http://schemas.microsoft.com/office/word/2010/wordprocessingCanvas" xmlns:cx="http://schemas.microsoft.com/office/drawing/2014/chartex" xmlns:cx1="http://schemas.microsoft.com/office/drawing/2015/9/8/chartex" xmlns:cx2="http://schemas.microsoft.com/office/drawing/2015/10/21/chartex" xmlns:cx3="http://schemas.microsoft.com/office/drawing/2016/5/9/chartex" xmlns:cx4="http://schemas.microsoft.com/office/drawing/2016/5/10/chartex" xmlns:cx5="http://schemas.microsoft.com/office/drawing/2016/5/11/chartex" xmlns:cx6="http://schemas.microsoft.com/office/drawing/2016/5/12/chartex" xmlns:cx7="http://schemas.microsoft.com/office/drawing/2016/5/13/chartex" xmlns:cx8="http://schemas.microsoft.com/office/drawing/2016/5/14/chartex" xmlns:mc="http://schemas.openxmlformats.org/markup-compatibility/2006" xmlns:aink="http://schemas.microsoft.com/office/drawing/2016/ink" xmlns:am3d="http://schemas.microsoft.com/office/drawing/2017/model3d" xmlns:o="urn:schemas-microsoft-com:office:office" xmlns:oel="http://schemas.microsoft.com/office/2019/extlst" xmlns:r="http://schemas.openxmlformats.org/officeDocument/2006/relationships" xmlns:m="http://schemas.openxmlformats.org/officeDocument/2006/math" xmlns:v="urn:schemas-microsoft-com:vml" xmlns:wp14="http://schemas.microsoft.com/office/word/2010/wordprocessingDrawing" xmlns:wp="http://schemas.openxmlformats.org/drawingml/2006/wordprocessingDrawing" xmlns:w10="urn:schemas-microsoft-com:office:word" xmlns:w="http://schemas.openxmlformats.org/wordprocessingml/2006/main" xmlns:w14="http://schemas.microsoft.com/office/word/2010/wordml" xmlns:w15="http://schemas.microsoft.com/office/word/2012/wordml" xmlns:w16cex="http://schemas.microsoft.com/office/word/2018/wordml/cex" xmlns:w16cid="http://schemas.microsoft.com/office/word/2016/wordml/cid" xmlns:w16="http://schemas.microsoft.com/office/word/2018/wordml" xmlns:w16du="http://schemas.microsoft.com/office/word/2023/wordml/word16du" xmlns:w16sdtdh="http://schemas.microsoft.com/office/word/2020/wordml/sdtdatahash" xmlns:w16sdtfl="http://schemas.microsoft.com/office/word/2024/wordml/sdtformatlock" xmlns:w16se="http://schemas.microsoft.com/office/word/2015/wordml/symex" xmlns:wpg="http://schemas.microsoft.com/office/word/2010/wordprocessingGroup" xmlns:wpi="http://schemas.microsoft.com/office/word/2010/wordprocessingInk" xmlns:wne="http://schemas.microsoft.com/office/word/2006/wordml" xmlns:wps="http://schemas.microsoft.com/office/word/2010/wordprocessingShape" mc:Ignorable="w14 w15 w16se w16cid w16 w16cex w16sdtdh w16sdtfl w16du wp14">
+<w:document xmlns:wpc="http://schemas.microsoft.com/office/word/2010/wordprocessingCanvas" xmlns:cx="http://schemas.microsoft.com/office/drawing/2014/chartex" xmlns:cx1="http://schemas.microsoft.com/office/drawing/2015/9/8/chartex" xmlns:cx2="http://schemas.microsoft.com/office/drawing/2015/10/21/chartex" xmlns:cx3="http://schemas.microsoft.com/office/drawing/2016/5/9/chartex" xmlns:cx4="http://schemas.microsoft.com/office/drawing/2016/5/10/chartex" xmlns:cx5="http://schemas.microsoft.com/office/drawing/2016/5/11/chartex" xmlns:cx6="http://schemas.microsoft.com/office/drawing/2016/5/12/chartex" xmlns:cx7="http://schemas.microsoft.com/office/drawing/2016/5/13/chartex" xmlns:cx8="http://schemas.microsoft.com/office/drawing/2016/5/14/chartex" xmlns:mc="http://schemas.openxmlformats.org/markup-compatibility/2006" xmlns:aink="http://schemas.microsoft.com/office/drawing/2016/ink" xmlns:am3d="http://schemas.microsoft.com/office/drawing/2017/model3d" xmlns:o="urn:schemas-microsoft-com:office:office" xmlns:oel="http://schemas.microsoft.com/office/2019/extlst" xmlns:r="http://schemas.openxmlformats.org/officeDocument/2006/relationships" xmlns:m="http://schemas.openxmlformats.org/officeDocument/2006/math" xmlns:v="urn:schemas-microsoft-com:vml" xmlns:wp14="http://schemas.microsoft.com/office/word/2010/wordprocessingDrawing" xmlns:wp="http://schemas.openxmlformats.org/drawingml/2006/wordprocessingDrawing" xmlns:w10="urn:schemas-microsoft-com:office:word" xmlns:w="http://schemas.openxmlformats.org/wordprocessingml/2006/main" xmlns:w14="http://schemas.microsoft.com/office/word/2010/wordml" xmlns:w15="http://schemas.microsoft.com/office/word/2012/wordml" xmlns:w16cex="http://schemas.microsoft.com/office/word/2018/wordml/cex" xmlns:w16cid="http://schemas.microsoft.com/office/word/2016/wordml/cid" xmlns:w16="http://schemas.microsoft.com/office/word/2018/wordml" xmlns:w16du="http://schemas.microsoft.com/office/word/2023/wordml/word16du" xmlns:w16sdtdh="http://schemas.microsoft.com/office/word/2020/wordml/sdtdatahash" xmlns:w16se="http://schemas.microsoft.com/office/word/2015/wordml/symex" xmlns:wpg="http://schemas.microsoft.com/office/word/2010/wordprocessingGroup" xmlns:wpi="http://schemas.microsoft.com/office/word/2010/wordprocessingInk" xmlns:wne="http://schemas.microsoft.com/office/word/2006/wordml" xmlns:wps="http://schemas.microsoft.com/office/word/2010/wordprocessingShape" mc:Ignorable="w14 w15 w16se w16cid w16 w16cex w16sdtdh wp14">
   <w:body>
     <w:p>
       <w:pPr>
@@ -85,6 +85,18 @@
           <w:vertAlign w:val="superscript"/>
         </w:rPr>
         <w:t xml:space="preserve"> </w:t>
+      </w:r>
+      <w:r>
+        <w:rPr>
+          <w:rFonts w:ascii="Times New Roman" w:hAnsi="Times New Roman" w:cs="Times New Roman"/>
+          <w:b/>
+          <w:bCs/>
+          <w:sz w:val="22"/>
+          <w:szCs w:val="22"/>
+          <w:u w:val="single"/>
+          <w:vertAlign w:val="superscript"/>
+        </w:rPr>
+        <w:t xml:space="preserve">a, </w:t>
       </w:r>
       <w:r>
         <w:rPr>
@@ -7379,11 +7391,19 @@
                 <w:rFonts w:ascii="Times New Roman" w:hAnsi="Times New Roman" w:cs="Times New Roman"/>
               </w:rPr>
             </w:pPr>
-            <w:r>
-              <w:rPr>
-                <w:rFonts w:ascii="Times New Roman" w:hAnsi="Times New Roman" w:cs="Times New Roman"/>
-              </w:rPr>
-              <w:t xml:space="preserve">Autorité de </w:t>
+            <w:proofErr w:type="spellStart"/>
+            <w:r>
+              <w:rPr>
+                <w:rFonts w:ascii="Times New Roman" w:hAnsi="Times New Roman" w:cs="Times New Roman"/>
+              </w:rPr>
+              <w:t>Autorité</w:t>
+            </w:r>
+            <w:proofErr w:type="spellEnd"/>
+            <w:r>
+              <w:rPr>
+                <w:rFonts w:ascii="Times New Roman" w:hAnsi="Times New Roman" w:cs="Times New Roman"/>
+              </w:rPr>
+              <w:t xml:space="preserve"> de </w:t>
             </w:r>
             <w:proofErr w:type="spellStart"/>
             <w:r>
@@ -7965,7 +7985,21 @@
         <w:rPr>
           <w:rFonts w:ascii="Times New Roman" w:hAnsi="Times New Roman" w:cs="Times New Roman"/>
         </w:rPr>
-        <w:t xml:space="preserve">Small Industrial (5,000–100,000 kWh/yr): 11,017 </w:t>
+        <w:t>Small Industrial (5,000–100,000 kWh/</w:t>
+      </w:r>
+      <w:proofErr w:type="spellStart"/>
+      <w:r>
+        <w:rPr>
+          <w:rFonts w:ascii="Times New Roman" w:hAnsi="Times New Roman" w:cs="Times New Roman"/>
+        </w:rPr>
+        <w:t>yr</w:t>
+      </w:r>
+      <w:proofErr w:type="spellEnd"/>
+      <w:r>
+        <w:rPr>
+          <w:rFonts w:ascii="Times New Roman" w:hAnsi="Times New Roman" w:cs="Times New Roman"/>
+        </w:rPr>
+        <w:t xml:space="preserve">): 11,017 </w:t>
       </w:r>
       <w:proofErr w:type="spellStart"/>
       <w:r>
@@ -8011,7 +8045,21 @@
         <w:rPr>
           <w:rFonts w:ascii="Times New Roman" w:hAnsi="Times New Roman" w:cs="Times New Roman"/>
         </w:rPr>
-        <w:t xml:space="preserve">Medium Industrial (100,000–1,000,000 kWh/yr): 10,514 </w:t>
+        <w:t>Medium Industrial (100,000–1,000,000 kWh/</w:t>
+      </w:r>
+      <w:proofErr w:type="spellStart"/>
+      <w:r>
+        <w:rPr>
+          <w:rFonts w:ascii="Times New Roman" w:hAnsi="Times New Roman" w:cs="Times New Roman"/>
+        </w:rPr>
+        <w:t>yr</w:t>
+      </w:r>
+      <w:proofErr w:type="spellEnd"/>
+      <w:r>
+        <w:rPr>
+          <w:rFonts w:ascii="Times New Roman" w:hAnsi="Times New Roman" w:cs="Times New Roman"/>
+        </w:rPr>
+        <w:t xml:space="preserve">): 10,514 </w:t>
       </w:r>
       <w:proofErr w:type="spellStart"/>
       <w:r>
@@ -8057,7 +8105,21 @@
         <w:rPr>
           <w:rFonts w:ascii="Times New Roman" w:hAnsi="Times New Roman" w:cs="Times New Roman"/>
         </w:rPr>
-        <w:t xml:space="preserve">Large Industrial (&gt;1,000,000 kWh/yr): 7,184 </w:t>
+        <w:t>Large Industrial (&gt;1,000,000 kWh/</w:t>
+      </w:r>
+      <w:proofErr w:type="spellStart"/>
+      <w:r>
+        <w:rPr>
+          <w:rFonts w:ascii="Times New Roman" w:hAnsi="Times New Roman" w:cs="Times New Roman"/>
+        </w:rPr>
+        <w:t>yr</w:t>
+      </w:r>
+      <w:proofErr w:type="spellEnd"/>
+      <w:r>
+        <w:rPr>
+          <w:rFonts w:ascii="Times New Roman" w:hAnsi="Times New Roman" w:cs="Times New Roman"/>
+        </w:rPr>
+        <w:t xml:space="preserve">): 7,184 </w:t>
       </w:r>
       <w:proofErr w:type="spellStart"/>
       <w:r>
@@ -8205,10 +8267,19 @@
           <w:rFonts w:ascii="Times New Roman" w:hAnsi="Times New Roman" w:cs="Times New Roman"/>
         </w:rPr>
       </w:pPr>
-      <w:r>
-        <w:rPr>
-          <w:rFonts w:ascii="Times New Roman" w:hAnsi="Times New Roman" w:cs="Times New Roman"/>
-        </w:rPr>
+    </w:p>
+    <w:p>
+      <w:pPr>
+        <w:jc w:val="both"/>
+        <w:rPr>
+          <w:rFonts w:ascii="Times New Roman" w:hAnsi="Times New Roman" w:cs="Times New Roman"/>
+        </w:rPr>
+      </w:pPr>
+      <w:r>
+        <w:rPr>
+          <w:rFonts w:ascii="Times New Roman" w:hAnsi="Times New Roman" w:cs="Times New Roman"/>
+        </w:rPr>
+        <w:lastRenderedPageBreak/>
         <w:t>Democratic Republic of the Congo (ARE / SNEL)</w:t>
       </w:r>
     </w:p>
@@ -8223,8 +8294,21 @@
         <w:rPr>
           <w:rFonts w:ascii="Times New Roman" w:hAnsi="Times New Roman" w:cs="Times New Roman"/>
         </w:rPr>
-        <w:lastRenderedPageBreak/>
-        <w:t xml:space="preserve">Governed by the Autorité de </w:t>
+        <w:t xml:space="preserve">Governed by the </w:t>
+      </w:r>
+      <w:proofErr w:type="spellStart"/>
+      <w:r>
+        <w:rPr>
+          <w:rFonts w:ascii="Times New Roman" w:hAnsi="Times New Roman" w:cs="Times New Roman"/>
+        </w:rPr>
+        <w:t>Autorité</w:t>
+      </w:r>
+      <w:proofErr w:type="spellEnd"/>
+      <w:r>
+        <w:rPr>
+          <w:rFonts w:ascii="Times New Roman" w:hAnsi="Times New Roman" w:cs="Times New Roman"/>
+        </w:rPr>
+        <w:t xml:space="preserve"> de </w:t>
       </w:r>
       <w:proofErr w:type="spellStart"/>
       <w:r>
@@ -9166,6 +9250,14 @@
           <w:rFonts w:ascii="Times New Roman" w:hAnsi="Times New Roman" w:cs="Times New Roman"/>
         </w:rPr>
       </w:pPr>
+    </w:p>
+    <w:p>
+      <w:pPr>
+        <w:jc w:val="both"/>
+        <w:rPr>
+          <w:rFonts w:ascii="Times New Roman" w:hAnsi="Times New Roman" w:cs="Times New Roman"/>
+        </w:rPr>
+      </w:pPr>
       <w:r>
         <w:rPr>
           <w:rFonts w:ascii="Times New Roman" w:hAnsi="Times New Roman" w:cs="Times New Roman"/>
@@ -9226,14 +9318,8 @@
         <w:rPr>
           <w:rFonts w:ascii="Times New Roman" w:hAnsi="Times New Roman" w:cs="Times New Roman"/>
         </w:rPr>
-        <w:t xml:space="preserve">Discussion: In Kenya, the primary value drivers are Peak Shaving (recovering capital in 2.83 years due to punitive CI1 low-voltage capacity charges of KES 1,100/kVA) and Industrial UPS functionality. The financial damages of plastic freezing in extruders during unannounced grid dips dwarfs standard energy savings, producing an overall system payback of 0.70 years and a 10-year </w:t>
-      </w:r>
-      <w:r>
-        <w:rPr>
-          <w:rFonts w:ascii="Times New Roman" w:hAnsi="Times New Roman" w:cs="Times New Roman"/>
-        </w:rPr>
         <w:lastRenderedPageBreak/>
-        <w:t>NPV of $3.98 million. Standalone grid-to-battery TOU arbitrage is unviable because the gross margin of $0.1205/kWh fails to clear the $0.1881/kWh LCOS threshold.</w:t>
+        <w:t>Discussion: In Kenya, the primary value drivers are Peak Shaving (recovering capital in 2.83 years due to punitive CI1 low-voltage capacity charges of KES 1,100/kVA) and Industrial UPS functionality. The financial damages of plastic freezing in extruders during unannounced grid dips dwarfs standard energy savings, producing an overall system payback of 0.70 years and a 10-year NPV of $3.98 million. Standalone grid-to-battery TOU arbitrage is unviable because the gross margin of $0.1205/kWh fails to clear the $0.1881/kWh LCOS threshold.</w:t>
       </w:r>
     </w:p>
     <w:p>
@@ -10143,6 +10229,14 @@
           <w:rFonts w:ascii="Times New Roman" w:hAnsi="Times New Roman" w:cs="Times New Roman"/>
         </w:rPr>
       </w:pPr>
+    </w:p>
+    <w:p>
+      <w:pPr>
+        <w:jc w:val="both"/>
+        <w:rPr>
+          <w:rFonts w:ascii="Times New Roman" w:hAnsi="Times New Roman" w:cs="Times New Roman"/>
+        </w:rPr>
+      </w:pPr>
       <w:r>
         <w:rPr>
           <w:rFonts w:ascii="Times New Roman" w:hAnsi="Times New Roman" w:cs="Times New Roman"/>
@@ -10442,6 +10536,7 @@
         <w:pStyle w:val="Quote"/>
       </w:pPr>
       <w:r>
+        <w:lastRenderedPageBreak/>
         <w:t xml:space="preserve">Table </w:t>
       </w:r>
       <w:r>
@@ -10518,14 +10613,7 @@
               <w:rPr>
                 <w:rFonts w:ascii="Times New Roman" w:hAnsi="Times New Roman" w:cs="Times New Roman"/>
               </w:rPr>
-              <w:t>TOU Margin (/</w:t>
-            </w:r>
-            <w:proofErr w:type="gramStart"/>
-            <w:r>
-              <w:rPr>
-                <w:rFonts w:ascii="Times New Roman" w:hAnsi="Times New Roman" w:cs="Times New Roman"/>
-              </w:rPr>
-              <w:t>kWh)</w:t>
+              <w:t>TOU Margin (/kWh)</w:t>
             </w:r>
             <w:r>
               <w:rPr>
@@ -10533,7 +10621,6 @@
               </w:rPr>
               <w:t>∣</w:t>
             </w:r>
-            <w:proofErr w:type="gramEnd"/>
             <w:r>
               <w:rPr>
                 <w:rFonts w:ascii="Times New Roman" w:hAnsi="Times New Roman" w:cs="Times New Roman"/>
@@ -10730,7 +10817,6 @@
               <w:rPr>
                 <w:rFonts w:ascii="Times New Roman" w:hAnsi="Times New Roman" w:cs="Times New Roman"/>
               </w:rPr>
-              <w:lastRenderedPageBreak/>
               <w:t>Uganda</w:t>
             </w:r>
           </w:p>
@@ -11234,6 +11320,7 @@
         <w:pStyle w:val="Heading3"/>
       </w:pPr>
       <w:r>
+        <w:lastRenderedPageBreak/>
         <w:t>Key Findings and Policy Insights</w:t>
       </w:r>
     </w:p>
@@ -11266,14 +11353,7 @@
         <w:rPr>
           <w:rFonts w:ascii="Times New Roman" w:hAnsi="Times New Roman" w:cs="Times New Roman"/>
         </w:rPr>
-        <w:t xml:space="preserve">/kVA/month during peak hours, falling to zero off-peak). Kenya follows closely (2.97 years) driven by KPLC’s flat KES </w:t>
-      </w:r>
-      <w:r>
-        <w:rPr>
-          <w:rFonts w:ascii="Times New Roman" w:hAnsi="Times New Roman" w:cs="Times New Roman"/>
-        </w:rPr>
-        <w:lastRenderedPageBreak/>
-        <w:t xml:space="preserve">1,100/kVA/month CI1 charges. In Tanzania, T2 demand charges (15,004 TZS/kVA) achieve a 3.15-year payback. </w:t>
+        <w:t xml:space="preserve">/kVA/month during peak hours, falling to zero off-peak). Kenya follows closely (2.97 years) driven by KPLC’s flat KES 1,100/kVA/month CI1 charges. In Tanzania, T2 demand charges (15,004 TZS/kVA) achieve a 3.15-year payback. </w:t>
       </w:r>
     </w:p>
     <w:p>
@@ -11407,7 +11487,14 @@
         <w:rPr>
           <w:rFonts w:ascii="Times New Roman" w:hAnsi="Times New Roman" w:cs="Times New Roman"/>
         </w:rPr>
-        <w:t>The varied and complex nature of the East African energy landscape necessitates that BESS hardware be governed by highly sophisticated, AI-driven Energy Management Systems (EMS). As demonstrated throughout this analysis, utility regulations are not homogenous across the region. Uganda's peak TOU window begins at 18:00, whereas Kenya's off-peak discount initiates at 22:00. Rwandan maximum demand charges differ depending on whether the spike occurs in peak or shoulder hours. Tanzania caps hybrid fossil fuel generation at 25%.   </w:t>
+        <w:t xml:space="preserve">The varied and complex nature of the East African energy landscape necessitates that BESS hardware be governed by highly sophisticated, AI-driven Energy Management Systems (EMS). As demonstrated throughout this analysis, utility regulations are not homogenous across the region. Uganda's peak TOU window begins at 18:00, whereas Kenya's off-peak discount initiates </w:t>
+      </w:r>
+      <w:r>
+        <w:rPr>
+          <w:rFonts w:ascii="Times New Roman" w:hAnsi="Times New Roman" w:cs="Times New Roman"/>
+        </w:rPr>
+        <w:lastRenderedPageBreak/>
+        <w:t>at 22:00. Rwandan maximum demand charges differ depending on whether the spike occurs in peak or shoulder hours. Tanzania caps hybrid fossil fuel generation at 25%.   </w:t>
       </w:r>
     </w:p>
     <w:p>
@@ -11421,14 +11508,7 @@
         <w:rPr>
           <w:rFonts w:ascii="Times New Roman" w:hAnsi="Times New Roman" w:cs="Times New Roman"/>
         </w:rPr>
-        <w:t xml:space="preserve">A static, purely reactive battery system cannot optimize financial returns in this dynamic environment. A localized, intelligent EMS is required to aggregate real-time data streams, including the facility’s instantaneous load profile, the specific temporal tariff structure of the </w:t>
-      </w:r>
-      <w:r>
-        <w:rPr>
-          <w:rFonts w:ascii="Times New Roman" w:hAnsi="Times New Roman" w:cs="Times New Roman"/>
-        </w:rPr>
-        <w:lastRenderedPageBreak/>
-        <w:t>national utility, and the real-time availability of on-site solar generation. The EMS utilizes predictive algorithms to autonomously dictate the BESS dispatch strategy</w:t>
+        <w:t>A static, purely reactive battery system cannot optimize financial returns in this dynamic environment. A localized, intelligent EMS is required to aggregate real-time data streams, including the facility’s instantaneous load profile, the specific temporal tariff structure of the national utility, and the real-time availability of on-site solar generation. The EMS utilizes predictive algorithms to autonomously dictate the BESS dispatch strategy</w:t>
       </w:r>
       <w:r>
         <w:rPr>
@@ -11600,6 +11680,7 @@
         <w:rPr>
           <w:rFonts w:ascii="Times New Roman" w:hAnsi="Times New Roman" w:cs="Times New Roman"/>
         </w:rPr>
+        <w:lastRenderedPageBreak/>
         <w:t xml:space="preserve">Parametric Constraints: The algorithm relies on parameterized equations and localized regulatory logic rather than executing computationally burdensome 8,760-hour time-series datasets or external meteorological files. </w:t>
       </w:r>
     </w:p>
@@ -11618,14 +11699,7 @@
         <w:rPr>
           <w:rFonts w:ascii="Times New Roman" w:hAnsi="Times New Roman" w:cs="Times New Roman"/>
         </w:rPr>
-        <w:t xml:space="preserve">CAPEX Sensitivity: The calculated payback periods are highly sensitive to global Lithium Iron Phosphate (LFP) supply chains; a theoretical 30% drop in BESS CAPEX (to </w:t>
-      </w:r>
-      <w:r>
-        <w:rPr>
-          <w:rFonts w:ascii="Times New Roman" w:hAnsi="Times New Roman" w:cs="Times New Roman"/>
-        </w:rPr>
-        <w:lastRenderedPageBreak/>
-        <w:t>$210/kWh) produces a near-linear 30% reduction in simple payback, potentially unlocking currently sub-economic Time-of-Use (TOU) arbitrage markets.</w:t>
+        <w:t>CAPEX Sensitivity: The calculated payback periods are highly sensitive to global Lithium Iron Phosphate (LFP) supply chains; a theoretical 30% drop in BESS CAPEX (to $210/kWh) produces a near-linear 30% reduction in simple payback, potentially unlocking currently sub-economic Time-of-Use (TOU) arbitrage markets.</w:t>
       </w:r>
     </w:p>
     <w:p>
@@ -11782,14 +11856,8 @@
         <w:rPr>
           <w:rFonts w:ascii="Times New Roman" w:hAnsi="Times New Roman" w:cs="Times New Roman"/>
         </w:rPr>
-        <w:t xml:space="preserve">Ultimately, the successful and profitable deployment of BESS across East Africa relies on the implementation of dynamic, software-driven Energy Management Systems capable of autonomously navigating the varied tariff and regulatory policies of each nation. As regional frameworks evolve—particularly regarding net-metering and grid-wheeling legislation—the </w:t>
-      </w:r>
-      <w:r>
-        <w:rPr>
-          <w:rFonts w:ascii="Times New Roman" w:hAnsi="Times New Roman" w:cs="Times New Roman"/>
-        </w:rPr>
         <w:lastRenderedPageBreak/>
-        <w:t>scalable integration of BESS will not only secure profitability for manufacturing hubs but will also provide much-needed buffer support to the stability and modernization of national electricity grids.</w:t>
+        <w:t>Ultimately, the successful and profitable deployment of BESS across East Africa relies on the implementation of dynamic, software-driven Energy Management Systems capable of autonomously navigating the varied tariff and regulatory policies of each nation. As regional frameworks evolve—particularly regarding net-metering and grid-wheeling legislation—the scalable integration of BESS will not only secure profitability for manufacturing hubs but will also provide much-needed buffer support to the stability and modernization of national electricity grids.</w:t>
       </w:r>
     </w:p>
     <w:p>
@@ -11825,7 +11893,7 @@
         <w:rPr>
           <w:rFonts w:ascii="Times New Roman" w:hAnsi="Times New Roman" w:cs="Times New Roman"/>
         </w:rPr>
-        <w:t xml:space="preserve">), and the Centre for Data Science and Artificial Intelligence (DSAIL). </w:t>
+        <w:t xml:space="preserve">) and the Centre for Data Science and Artificial Intelligence (DSAIL). </w:t>
       </w:r>
       <w:r>
         <w:rPr>
@@ -11879,14 +11947,6 @@
         </w:rPr>
         <w:t xml:space="preserve"> declare that there are no commercial associations, financial disclosures or conflicts of interest that could pose a potential conflict regarding the research, authorship, or publication of this paper.</w:t>
       </w:r>
-    </w:p>
-    <w:p>
-      <w:pPr>
-        <w:jc w:val="both"/>
-        <w:rPr>
-          <w:rFonts w:ascii="Times New Roman" w:hAnsi="Times New Roman" w:cs="Times New Roman"/>
-        </w:rPr>
-      </w:pPr>
     </w:p>
     <w:p>
       <w:pPr>
@@ -11909,6 +11969,9 @@
     <w:p>
       <w:pPr>
         <w:pStyle w:val="Bibliography"/>
+        <w:rPr>
+          <w:rFonts w:ascii="Times New Roman" w:hAnsi="Times New Roman" w:cs="Times New Roman"/>
+        </w:rPr>
       </w:pPr>
       <w:r>
         <w:rPr>
@@ -11932,425 +11995,645 @@
         <w:rPr>
           <w:rFonts w:ascii="Times New Roman" w:hAnsi="Times New Roman" w:cs="Times New Roman"/>
         </w:rPr>
-        <w:t>Ariya</w:t>
-      </w:r>
-      <w:r>
-        <w:t xml:space="preserve">, K. (n.d.). </w:t>
-      </w:r>
-      <w:r>
-        <w:rPr>
+        <w:t xml:space="preserve">Ariya, K. (n.d.). </w:t>
+      </w:r>
+      <w:r>
+        <w:rPr>
+          <w:rFonts w:ascii="Times New Roman" w:hAnsi="Times New Roman" w:cs="Times New Roman"/>
           <w:i/>
           <w:iCs/>
         </w:rPr>
         <w:t>Democratic Republic of the Congo electricity prices, December 2025</w:t>
       </w:r>
       <w:r>
+        <w:rPr>
+          <w:rFonts w:ascii="Times New Roman" w:hAnsi="Times New Roman" w:cs="Times New Roman"/>
+        </w:rPr>
         <w:t>. GlobalPetrolPrices. GlobalPetrolPrices.Com. Retrieved August 15, 2026, from https://www.globalpetrolprices.com/Democratic-Republic-of-the-Congo/electricity_prices/</w:t>
       </w:r>
     </w:p>
     <w:p>
       <w:pPr>
         <w:pStyle w:val="Bibliography"/>
-      </w:pPr>
-      <w:r>
+        <w:rPr>
+          <w:rFonts w:ascii="Times New Roman" w:hAnsi="Times New Roman" w:cs="Times New Roman"/>
+        </w:rPr>
+      </w:pPr>
+      <w:r>
+        <w:rPr>
+          <w:rFonts w:ascii="Times New Roman" w:hAnsi="Times New Roman" w:cs="Times New Roman"/>
+        </w:rPr>
         <w:t xml:space="preserve">Banza, B. B., Balume, S. B., Kakeza, A. M., Kasilembo, Y. M., Kawinda, A. M., Tungadio, H. D., &amp; Kiseya, F. T. (2026). </w:t>
       </w:r>
       <w:r>
         <w:rPr>
+          <w:rFonts w:ascii="Times New Roman" w:hAnsi="Times New Roman" w:cs="Times New Roman"/>
           <w:i/>
           <w:iCs/>
         </w:rPr>
         <w:t>Analysis of Industrial-Scale Electricity Supply in South-Eastern DR Congo</w:t>
       </w:r>
       <w:r>
+        <w:rPr>
+          <w:rFonts w:ascii="Times New Roman" w:hAnsi="Times New Roman" w:cs="Times New Roman"/>
+        </w:rPr>
         <w:t>. Engineering. https://doi.org/10.20944/preprints202604.1465.v1</w:t>
       </w:r>
     </w:p>
     <w:p>
       <w:pPr>
         <w:pStyle w:val="Bibliography"/>
-      </w:pPr>
-      <w:r>
+        <w:rPr>
+          <w:rFonts w:ascii="Times New Roman" w:hAnsi="Times New Roman" w:cs="Times New Roman"/>
+        </w:rPr>
+      </w:pPr>
+      <w:r>
+        <w:rPr>
+          <w:rFonts w:ascii="Times New Roman" w:hAnsi="Times New Roman" w:cs="Times New Roman"/>
+        </w:rPr>
         <w:t xml:space="preserve">Bimenyimana, S., Asemota, G. N. O., &amp; Li, L. (2018). The State of the Power Sector in Rwanda: A Progressive Sector With Ambitious Targets. </w:t>
       </w:r>
       <w:r>
         <w:rPr>
+          <w:rFonts w:ascii="Times New Roman" w:hAnsi="Times New Roman" w:cs="Times New Roman"/>
           <w:i/>
           <w:iCs/>
         </w:rPr>
         <w:t>Frontiers in Energy Research</w:t>
       </w:r>
       <w:r>
+        <w:rPr>
+          <w:rFonts w:ascii="Times New Roman" w:hAnsi="Times New Roman" w:cs="Times New Roman"/>
+        </w:rPr>
         <w:t xml:space="preserve">, </w:t>
       </w:r>
       <w:r>
         <w:rPr>
+          <w:rFonts w:ascii="Times New Roman" w:hAnsi="Times New Roman" w:cs="Times New Roman"/>
           <w:i/>
           <w:iCs/>
         </w:rPr>
         <w:t>6</w:t>
       </w:r>
       <w:r>
+        <w:rPr>
+          <w:rFonts w:ascii="Times New Roman" w:hAnsi="Times New Roman" w:cs="Times New Roman"/>
+        </w:rPr>
         <w:t>, 68. https://doi.org/10.3389/fenrg.2018.00068</w:t>
       </w:r>
     </w:p>
     <w:p>
       <w:pPr>
         <w:pStyle w:val="Bibliography"/>
-      </w:pPr>
-      <w:r>
+        <w:rPr>
+          <w:rFonts w:ascii="Times New Roman" w:hAnsi="Times New Roman" w:cs="Times New Roman"/>
+        </w:rPr>
+      </w:pPr>
+      <w:r>
+        <w:rPr>
+          <w:rFonts w:ascii="Times New Roman" w:hAnsi="Times New Roman" w:cs="Times New Roman"/>
+        </w:rPr>
         <w:lastRenderedPageBreak/>
         <w:t xml:space="preserve">Clark, T. (2026, June 2). What Is Peak Shaving? Use Battery Storage to Cut Your Electricity Bill. </w:t>
       </w:r>
       <w:r>
         <w:rPr>
+          <w:rFonts w:ascii="Times New Roman" w:hAnsi="Times New Roman" w:cs="Times New Roman"/>
           <w:i/>
           <w:iCs/>
         </w:rPr>
         <w:t>Deye ESS</w:t>
       </w:r>
       <w:r>
+        <w:rPr>
+          <w:rFonts w:ascii="Times New Roman" w:hAnsi="Times New Roman" w:cs="Times New Roman"/>
+        </w:rPr>
         <w:t>. https://deyeess.com/what-is-peak-shaving-use-battery-storage-to-cut-your-electricity-bill/</w:t>
       </w:r>
     </w:p>
     <w:p>
       <w:pPr>
         <w:pStyle w:val="Bibliography"/>
-      </w:pPr>
-      <w:r>
+        <w:rPr>
+          <w:rFonts w:ascii="Times New Roman" w:hAnsi="Times New Roman" w:cs="Times New Roman"/>
+        </w:rPr>
+      </w:pPr>
+      <w:r>
+        <w:rPr>
+          <w:rFonts w:ascii="Times New Roman" w:hAnsi="Times New Roman" w:cs="Times New Roman"/>
+        </w:rPr>
         <w:t xml:space="preserve">Gatanga, C. (2025, May 28). </w:t>
       </w:r>
       <w:r>
         <w:rPr>
+          <w:rFonts w:ascii="Times New Roman" w:hAnsi="Times New Roman" w:cs="Times New Roman"/>
           <w:i/>
           <w:iCs/>
         </w:rPr>
         <w:t>LiFePO4 ESS Kenya: Unshakeable 10-Yr Power | 90% Savings</w:t>
       </w:r>
       <w:r>
+        <w:rPr>
+          <w:rFonts w:ascii="Times New Roman" w:hAnsi="Times New Roman" w:cs="Times New Roman"/>
+        </w:rPr>
         <w:t>. coollithium. Coollithium.Com. https://coolithium.com/lifepo4-ess-kenya/</w:t>
       </w:r>
     </w:p>
     <w:p>
       <w:pPr>
         <w:pStyle w:val="Bibliography"/>
-      </w:pPr>
-      <w:r>
+        <w:rPr>
+          <w:rFonts w:ascii="Times New Roman" w:hAnsi="Times New Roman" w:cs="Times New Roman"/>
+        </w:rPr>
+      </w:pPr>
+      <w:r>
+        <w:rPr>
+          <w:rFonts w:ascii="Times New Roman" w:hAnsi="Times New Roman" w:cs="Times New Roman"/>
+        </w:rPr>
         <w:t xml:space="preserve">Gruver, W., &amp; Fredericks, M. (2026, March 14). USP&amp;E Global: Leading Hybrid Renewable And Thermal EPC. </w:t>
       </w:r>
       <w:r>
         <w:rPr>
+          <w:rFonts w:ascii="Times New Roman" w:hAnsi="Times New Roman" w:cs="Times New Roman"/>
           <w:i/>
           <w:iCs/>
         </w:rPr>
         <w:t>Uspeglobal.Com</w:t>
       </w:r>
       <w:r>
+        <w:rPr>
+          <w:rFonts w:ascii="Times New Roman" w:hAnsi="Times New Roman" w:cs="Times New Roman"/>
+        </w:rPr>
         <w:t>. https://uspeglobal.com/articles/leading-hybrid-renewable-and-thermal-epc/</w:t>
       </w:r>
     </w:p>
     <w:p>
       <w:pPr>
         <w:pStyle w:val="Bibliography"/>
-      </w:pPr>
-      <w:r>
+        <w:rPr>
+          <w:rFonts w:ascii="Times New Roman" w:hAnsi="Times New Roman" w:cs="Times New Roman"/>
+        </w:rPr>
+      </w:pPr>
+      <w:r>
+        <w:rPr>
+          <w:rFonts w:ascii="Times New Roman" w:hAnsi="Times New Roman" w:cs="Times New Roman"/>
+        </w:rPr>
         <w:t xml:space="preserve">Helena, T. (2022, January 18). </w:t>
       </w:r>
       <w:r>
         <w:rPr>
+          <w:rFonts w:ascii="Times New Roman" w:hAnsi="Times New Roman" w:cs="Times New Roman"/>
           <w:i/>
           <w:iCs/>
         </w:rPr>
         <w:t>Peak Shaving for Factories: Cutting Demand Charges with BESS</w:t>
       </w:r>
       <w:r>
+        <w:rPr>
+          <w:rFonts w:ascii="Times New Roman" w:hAnsi="Times New Roman" w:cs="Times New Roman"/>
+        </w:rPr>
         <w:t>. PowerKonnect. Peak Shaving for Factories. https://powerkonnekt.com/articles/peak-shaving-for-factories</w:t>
       </w:r>
     </w:p>
     <w:p>
       <w:pPr>
         <w:pStyle w:val="Bibliography"/>
-      </w:pPr>
-      <w:r>
+        <w:rPr>
+          <w:rFonts w:ascii="Times New Roman" w:hAnsi="Times New Roman" w:cs="Times New Roman"/>
+        </w:rPr>
+      </w:pPr>
+      <w:r>
+        <w:rPr>
+          <w:rFonts w:ascii="Times New Roman" w:hAnsi="Times New Roman" w:cs="Times New Roman"/>
+        </w:rPr>
         <w:t xml:space="preserve">Kikomeko, P., &amp; Magoola, P. (2023, May 6). </w:t>
       </w:r>
       <w:r>
         <w:rPr>
+          <w:rFonts w:ascii="Times New Roman" w:hAnsi="Times New Roman" w:cs="Times New Roman"/>
           <w:i/>
           <w:iCs/>
         </w:rPr>
         <w:t>Understanding Your Bill: Cost of Electricity in Kenya</w:t>
       </w:r>
       <w:r>
+        <w:rPr>
+          <w:rFonts w:ascii="Times New Roman" w:hAnsi="Times New Roman" w:cs="Times New Roman"/>
+        </w:rPr>
         <w:t>. MEP Engineering. Reigaisolut.Co.Ke. https://reigaisolut.co.ke/understanding-the-cost-of-electricity-in-kenya/</w:t>
       </w:r>
     </w:p>
     <w:p>
       <w:pPr>
         <w:pStyle w:val="Bibliography"/>
-      </w:pPr>
-      <w:r>
+        <w:rPr>
+          <w:rFonts w:ascii="Times New Roman" w:hAnsi="Times New Roman" w:cs="Times New Roman"/>
+        </w:rPr>
+      </w:pPr>
+      <w:r>
+        <w:rPr>
+          <w:rFonts w:ascii="Times New Roman" w:hAnsi="Times New Roman" w:cs="Times New Roman"/>
+        </w:rPr>
         <w:t xml:space="preserve">Kitonto, S. (2025, November 12). </w:t>
       </w:r>
       <w:r>
         <w:rPr>
+          <w:rFonts w:ascii="Times New Roman" w:hAnsi="Times New Roman" w:cs="Times New Roman"/>
           <w:i/>
           <w:iCs/>
         </w:rPr>
         <w:t>Uganda Electricity Tariff Rates Q4 2025 | PDF | Electric Power Distribution | Electricity</w:t>
       </w:r>
       <w:r>
+        <w:rPr>
+          <w:rFonts w:ascii="Times New Roman" w:hAnsi="Times New Roman" w:cs="Times New Roman"/>
+        </w:rPr>
         <w:t>. UEDCL. Scribd. https://www.scribd.com/document/967463774/Tariffs</w:t>
       </w:r>
     </w:p>
     <w:p>
       <w:pPr>
         <w:pStyle w:val="Bibliography"/>
-      </w:pPr>
-      <w:r>
+        <w:rPr>
+          <w:rFonts w:ascii="Times New Roman" w:hAnsi="Times New Roman" w:cs="Times New Roman"/>
+        </w:rPr>
+      </w:pPr>
+      <w:r>
+        <w:rPr>
+          <w:rFonts w:ascii="Times New Roman" w:hAnsi="Times New Roman" w:cs="Times New Roman"/>
+        </w:rPr>
         <w:t xml:space="preserve">Lukamba-Muhiya, J. M., &amp; Uken, E. (2006). The electricity supply industry in the Democratic Republic of the Congo. </w:t>
       </w:r>
       <w:r>
         <w:rPr>
+          <w:rFonts w:ascii="Times New Roman" w:hAnsi="Times New Roman" w:cs="Times New Roman"/>
           <w:i/>
           <w:iCs/>
         </w:rPr>
         <w:t>Journal of Energy in Southern Africa</w:t>
       </w:r>
       <w:r>
+        <w:rPr>
+          <w:rFonts w:ascii="Times New Roman" w:hAnsi="Times New Roman" w:cs="Times New Roman"/>
+        </w:rPr>
         <w:t xml:space="preserve">, </w:t>
       </w:r>
       <w:r>
         <w:rPr>
+          <w:rFonts w:ascii="Times New Roman" w:hAnsi="Times New Roman" w:cs="Times New Roman"/>
           <w:i/>
           <w:iCs/>
         </w:rPr>
         <w:t>17</w:t>
       </w:r>
       <w:r>
+        <w:rPr>
+          <w:rFonts w:ascii="Times New Roman" w:hAnsi="Times New Roman" w:cs="Times New Roman"/>
+        </w:rPr>
         <w:t>(3), 21–28. https://doi.org/10.17159/2413-3051/2006/v17i3a3261</w:t>
       </w:r>
     </w:p>
     <w:p>
       <w:pPr>
         <w:pStyle w:val="Bibliography"/>
-      </w:pPr>
-      <w:r>
-        <w:t xml:space="preserve">Mburamatare, D., Gboney, W. K., &amp; Hakizimana, J. D. D. (2022). Electricity Tariff Design “Theoretical Concepts Vs Practices”: Review of Tariff Design Approaches in East Africa - </w:t>
-      </w:r>
-      <w:r>
+        <w:rPr>
+          <w:rFonts w:ascii="Times New Roman" w:hAnsi="Times New Roman" w:cs="Times New Roman"/>
+        </w:rPr>
+      </w:pPr>
+      <w:r>
+        <w:rPr>
+          <w:rFonts w:ascii="Times New Roman" w:hAnsi="Times New Roman" w:cs="Times New Roman"/>
+        </w:rPr>
+        <w:t xml:space="preserve">Mburamatare, D., Gboney, W. K., &amp; Hakizimana, J. D. D. (2022). Electricity Tariff Design “Theoretical Concepts Vs Practices”: Review of Tariff Design Approaches in East Africa </w:t>
+      </w:r>
+      <w:r>
+        <w:rPr>
+          <w:rFonts w:ascii="Times New Roman" w:hAnsi="Times New Roman" w:cs="Times New Roman"/>
+        </w:rPr>
         <w:lastRenderedPageBreak/>
-        <w:t xml:space="preserve">Case Studies of Rwanda, Kenya, Uganda and Tanzania. </w:t>
-      </w:r>
-      <w:r>
-        <w:rPr>
+        <w:t xml:space="preserve">- Case Studies of Rwanda, Kenya, Uganda and Tanzania. </w:t>
+      </w:r>
+      <w:r>
+        <w:rPr>
+          <w:rFonts w:ascii="Times New Roman" w:hAnsi="Times New Roman" w:cs="Times New Roman"/>
           <w:i/>
           <w:iCs/>
         </w:rPr>
         <w:t>International Journal of Energy Economics and Policy</w:t>
       </w:r>
       <w:r>
+        <w:rPr>
+          <w:rFonts w:ascii="Times New Roman" w:hAnsi="Times New Roman" w:cs="Times New Roman"/>
+        </w:rPr>
         <w:t xml:space="preserve">, </w:t>
       </w:r>
       <w:r>
         <w:rPr>
+          <w:rFonts w:ascii="Times New Roman" w:hAnsi="Times New Roman" w:cs="Times New Roman"/>
           <w:i/>
           <w:iCs/>
         </w:rPr>
         <w:t>12</w:t>
       </w:r>
       <w:r>
+        <w:rPr>
+          <w:rFonts w:ascii="Times New Roman" w:hAnsi="Times New Roman" w:cs="Times New Roman"/>
+        </w:rPr>
         <w:t>(5), 260–273. https://doi.org/10.32479/ijeep.13294</w:t>
       </w:r>
     </w:p>
     <w:p>
       <w:pPr>
         <w:pStyle w:val="Bibliography"/>
-      </w:pPr>
-      <w:r>
+        <w:rPr>
+          <w:rFonts w:ascii="Times New Roman" w:hAnsi="Times New Roman" w:cs="Times New Roman"/>
+        </w:rPr>
+      </w:pPr>
+      <w:r>
+        <w:rPr>
+          <w:rFonts w:ascii="Times New Roman" w:hAnsi="Times New Roman" w:cs="Times New Roman"/>
+        </w:rPr>
         <w:t xml:space="preserve">Mbuwiri, T. (2025, May 16). </w:t>
       </w:r>
       <w:r>
         <w:rPr>
+          <w:rFonts w:ascii="Times New Roman" w:hAnsi="Times New Roman" w:cs="Times New Roman"/>
           <w:i/>
           <w:iCs/>
         </w:rPr>
         <w:t>TANESCO</w:t>
       </w:r>
       <w:r>
+        <w:rPr>
+          <w:rFonts w:ascii="Times New Roman" w:hAnsi="Times New Roman" w:cs="Times New Roman"/>
+        </w:rPr>
         <w:t>. TANESCO. https://www.tanesco.co.tz/generation</w:t>
       </w:r>
     </w:p>
     <w:p>
       <w:pPr>
         <w:pStyle w:val="Bibliography"/>
-      </w:pPr>
-      <w:r>
+        <w:rPr>
+          <w:rFonts w:ascii="Times New Roman" w:hAnsi="Times New Roman" w:cs="Times New Roman"/>
+        </w:rPr>
+      </w:pPr>
+      <w:r>
+        <w:rPr>
+          <w:rFonts w:ascii="Times New Roman" w:hAnsi="Times New Roman" w:cs="Times New Roman"/>
+        </w:rPr>
         <w:t xml:space="preserve">Mhamsi, R. (2025, November 17). </w:t>
       </w:r>
       <w:r>
         <w:rPr>
+          <w:rFonts w:ascii="Times New Roman" w:hAnsi="Times New Roman" w:cs="Times New Roman"/>
           <w:i/>
           <w:iCs/>
         </w:rPr>
         <w:t>Tariffs</w:t>
       </w:r>
       <w:r>
+        <w:rPr>
+          <w:rFonts w:ascii="Times New Roman" w:hAnsi="Times New Roman" w:cs="Times New Roman"/>
+        </w:rPr>
         <w:t>. Rwanda Energy Group. https://www.reg.rw/customer-service/tariffs/</w:t>
       </w:r>
     </w:p>
     <w:p>
       <w:pPr>
         <w:pStyle w:val="Bibliography"/>
-      </w:pPr>
-      <w:r>
+        <w:rPr>
+          <w:rFonts w:ascii="Times New Roman" w:hAnsi="Times New Roman" w:cs="Times New Roman"/>
+        </w:rPr>
+      </w:pPr>
+      <w:r>
+        <w:rPr>
+          <w:rFonts w:ascii="Times New Roman" w:hAnsi="Times New Roman" w:cs="Times New Roman"/>
+        </w:rPr>
         <w:t xml:space="preserve">Michael, A. (2026, June 21). Explainer: How EPRA’s new electricity bill will affect households and businesses. </w:t>
       </w:r>
       <w:r>
         <w:rPr>
+          <w:rFonts w:ascii="Times New Roman" w:hAnsi="Times New Roman" w:cs="Times New Roman"/>
           <w:i/>
           <w:iCs/>
         </w:rPr>
         <w:t>People Daily</w:t>
       </w:r>
       <w:r>
+        <w:rPr>
+          <w:rFonts w:ascii="Times New Roman" w:hAnsi="Times New Roman" w:cs="Times New Roman"/>
+        </w:rPr>
         <w:t>. https://peopledaily.digital/business/explainer-how-epras-new-electricity-bill-will-affect-households-and-businesses</w:t>
       </w:r>
     </w:p>
     <w:p>
       <w:pPr>
         <w:pStyle w:val="Bibliography"/>
-      </w:pPr>
-      <w:r>
+        <w:rPr>
+          <w:rFonts w:ascii="Times New Roman" w:hAnsi="Times New Roman" w:cs="Times New Roman"/>
+        </w:rPr>
+      </w:pPr>
+      <w:r>
+        <w:rPr>
+          <w:rFonts w:ascii="Times New Roman" w:hAnsi="Times New Roman" w:cs="Times New Roman"/>
+        </w:rPr>
         <w:t xml:space="preserve">Mohammed, A. (2026, May 27). </w:t>
       </w:r>
       <w:r>
         <w:rPr>
+          <w:rFonts w:ascii="Times New Roman" w:hAnsi="Times New Roman" w:cs="Times New Roman"/>
           <w:i/>
           <w:iCs/>
         </w:rPr>
         <w:t>Tanzania Solar Compliance Guide 2026: Grid Connection, TANESCO Permits &amp; Rural Electrification</w:t>
       </w:r>
       <w:r>
+        <w:rPr>
+          <w:rFonts w:ascii="Times New Roman" w:hAnsi="Times New Roman" w:cs="Times New Roman"/>
+        </w:rPr>
         <w:t>. surgepv.com. SurgePV. https://www.surgepv.com/solar-compliance/tanzania</w:t>
       </w:r>
     </w:p>
     <w:p>
       <w:pPr>
         <w:pStyle w:val="Bibliography"/>
-      </w:pPr>
-      <w:r>
+        <w:rPr>
+          <w:rFonts w:ascii="Times New Roman" w:hAnsi="Times New Roman" w:cs="Times New Roman"/>
+        </w:rPr>
+      </w:pPr>
+      <w:r>
+        <w:rPr>
+          <w:rFonts w:ascii="Times New Roman" w:hAnsi="Times New Roman" w:cs="Times New Roman"/>
+        </w:rPr>
         <w:t xml:space="preserve">Museveni, J. (2026, March 12). </w:t>
       </w:r>
       <w:r>
         <w:rPr>
+          <w:rFonts w:ascii="Times New Roman" w:hAnsi="Times New Roman" w:cs="Times New Roman"/>
           <w:i/>
           <w:iCs/>
         </w:rPr>
         <w:t>Schedule of Electricity Prices For q3 2026 | PDF | Tariff | Electricity</w:t>
       </w:r>
       <w:r>
+        <w:rPr>
+          <w:rFonts w:ascii="Times New Roman" w:hAnsi="Times New Roman" w:cs="Times New Roman"/>
+        </w:rPr>
         <w:t>. Scribd. https://www.scribd.com/document/1057475467/Schedule-of-Electricity-Prices-for-q3-2026</w:t>
       </w:r>
     </w:p>
     <w:p>
       <w:pPr>
         <w:pStyle w:val="Bibliography"/>
-      </w:pPr>
-      <w:r>
+        <w:rPr>
+          <w:rFonts w:ascii="Times New Roman" w:hAnsi="Times New Roman" w:cs="Times New Roman"/>
+        </w:rPr>
+      </w:pPr>
+      <w:r>
+        <w:rPr>
+          <w:rFonts w:ascii="Times New Roman" w:hAnsi="Times New Roman" w:cs="Times New Roman"/>
+        </w:rPr>
         <w:t xml:space="preserve">Mwangi. (2021, January 13). </w:t>
       </w:r>
       <w:r>
         <w:rPr>
+          <w:rFonts w:ascii="Times New Roman" w:hAnsi="Times New Roman" w:cs="Times New Roman"/>
           <w:i/>
           <w:iCs/>
         </w:rPr>
         <w:t>Electricity cost in Kenya</w:t>
       </w:r>
       <w:r>
+        <w:rPr>
+          <w:rFonts w:ascii="Times New Roman" w:hAnsi="Times New Roman" w:cs="Times New Roman"/>
+        </w:rPr>
         <w:t>. stimatracker.com. Stimatracker. https://www.stimatracker.com/</w:t>
       </w:r>
     </w:p>
     <w:p>
       <w:pPr>
         <w:pStyle w:val="Bibliography"/>
-      </w:pPr>
-      <w:r>
+        <w:rPr>
+          <w:rFonts w:ascii="Times New Roman" w:hAnsi="Times New Roman" w:cs="Times New Roman"/>
+        </w:rPr>
+      </w:pPr>
+      <w:r>
+        <w:rPr>
+          <w:rFonts w:ascii="Times New Roman" w:hAnsi="Times New Roman" w:cs="Times New Roman"/>
+        </w:rPr>
         <w:t xml:space="preserve">Ojo, O. T., Adenuga, O. T., Kanakana-Katumba, M. G., Nenzhelele, T., &amp; Mwachinduka, F. (2026). Optimization of Solar PV Renewable Energy System Integration for Mining Dewatering Operations. </w:t>
       </w:r>
       <w:r>
         <w:rPr>
+          <w:rFonts w:ascii="Times New Roman" w:hAnsi="Times New Roman" w:cs="Times New Roman"/>
           <w:i/>
           <w:iCs/>
         </w:rPr>
         <w:t>ABUAD Journal of Engineering Research and Development (AJERD)</w:t>
       </w:r>
       <w:r>
+        <w:rPr>
+          <w:rFonts w:ascii="Times New Roman" w:hAnsi="Times New Roman" w:cs="Times New Roman"/>
+        </w:rPr>
         <w:t xml:space="preserve">, </w:t>
       </w:r>
       <w:r>
         <w:rPr>
+          <w:rFonts w:ascii="Times New Roman" w:hAnsi="Times New Roman" w:cs="Times New Roman"/>
           <w:i/>
           <w:iCs/>
         </w:rPr>
         <w:t>9</w:t>
       </w:r>
       <w:r>
+        <w:rPr>
+          <w:rFonts w:ascii="Times New Roman" w:hAnsi="Times New Roman" w:cs="Times New Roman"/>
+        </w:rPr>
         <w:t>(1), 38–56. https://doi.org/10.53982/ajerd.2026.0901.04-j</w:t>
       </w:r>
     </w:p>
     <w:p>
       <w:pPr>
         <w:pStyle w:val="Bibliography"/>
-      </w:pPr>
-      <w:r>
-        <w:lastRenderedPageBreak/>
+        <w:rPr>
+          <w:rFonts w:ascii="Times New Roman" w:hAnsi="Times New Roman" w:cs="Times New Roman"/>
+        </w:rPr>
+      </w:pPr>
+      <w:r>
+        <w:rPr>
+          <w:rFonts w:ascii="Times New Roman" w:hAnsi="Times New Roman" w:cs="Times New Roman"/>
+        </w:rPr>
         <w:t xml:space="preserve">Otter, T. (2026, July 3). </w:t>
       </w:r>
       <w:r>
         <w:rPr>
+          <w:rFonts w:ascii="Times New Roman" w:hAnsi="Times New Roman" w:cs="Times New Roman"/>
           <w:i/>
           <w:iCs/>
         </w:rPr>
         <w:t>BESS for Business: Commercial Battery Storage Australia Guide by Ottergrid</w:t>
       </w:r>
       <w:r>
+        <w:rPr>
+          <w:rFonts w:ascii="Times New Roman" w:hAnsi="Times New Roman" w:cs="Times New Roman"/>
+        </w:rPr>
         <w:t>. Ottergrid. https://www.ottergrid.com/post/bess-explained-what-commercial-and-industrial-businesses-need-to-know-before-investing</w:t>
       </w:r>
     </w:p>
     <w:p>
       <w:pPr>
         <w:pStyle w:val="Bibliography"/>
-      </w:pPr>
-      <w:r>
+        <w:rPr>
+          <w:rFonts w:ascii="Times New Roman" w:hAnsi="Times New Roman" w:cs="Times New Roman"/>
+        </w:rPr>
+      </w:pPr>
+      <w:r>
+        <w:rPr>
+          <w:rFonts w:ascii="Times New Roman" w:hAnsi="Times New Roman" w:cs="Times New Roman"/>
+        </w:rPr>
+        <w:lastRenderedPageBreak/>
         <w:t xml:space="preserve">Rusek, J. (2026, June 28). Demand Charges Explained: How Utilities Calculate Peak Power Costs. </w:t>
       </w:r>
       <w:r>
         <w:rPr>
+          <w:rFonts w:ascii="Times New Roman" w:hAnsi="Times New Roman" w:cs="Times New Roman"/>
           <w:i/>
           <w:iCs/>
         </w:rPr>
         <w:t>Elum</w:t>
       </w:r>
       <w:r>
+        <w:rPr>
+          <w:rFonts w:ascii="Times New Roman" w:hAnsi="Times New Roman" w:cs="Times New Roman"/>
+        </w:rPr>
         <w:t>. https://elum-energy.com/blog/demand-charges-explained-how-utilities-calculate-peak-power-costs/</w:t>
       </w:r>
     </w:p>
     <w:p>
       <w:pPr>
         <w:pStyle w:val="Bibliography"/>
-      </w:pPr>
-      <w:r>
+        <w:rPr>
+          <w:rFonts w:ascii="Times New Roman" w:hAnsi="Times New Roman" w:cs="Times New Roman"/>
+        </w:rPr>
+      </w:pPr>
+      <w:r>
+        <w:rPr>
+          <w:rFonts w:ascii="Times New Roman" w:hAnsi="Times New Roman" w:cs="Times New Roman"/>
+        </w:rPr>
         <w:t xml:space="preserve">Twain, Y. (2024, May 8). </w:t>
       </w:r>
       <w:r>
         <w:rPr>
+          <w:rFonts w:ascii="Times New Roman" w:hAnsi="Times New Roman" w:cs="Times New Roman"/>
           <w:i/>
           <w:iCs/>
         </w:rPr>
         <w:t>BESS Container Solutions | Raycore Energy</w:t>
       </w:r>
       <w:r>
+        <w:rPr>
+          <w:rFonts w:ascii="Times New Roman" w:hAnsi="Times New Roman" w:cs="Times New Roman"/>
+        </w:rPr>
         <w:t>. Raycore Energy. Raycore Energy. https://www.raycoreenergy.co.ke/bess-container-solutions</w:t>
       </w:r>
     </w:p>
@@ -12367,6 +12650,14 @@
         </w:rPr>
         <w:fldChar w:fldCharType="end"/>
       </w:r>
+    </w:p>
+    <w:p>
+      <w:pPr>
+        <w:jc w:val="both"/>
+        <w:rPr>
+          <w:rFonts w:ascii="Times New Roman" w:hAnsi="Times New Roman" w:cs="Times New Roman"/>
+        </w:rPr>
+      </w:pPr>
     </w:p>
     <w:sectPr>
       <w:pgSz w:w="12240" w:h="15840"/>
@@ -12379,7 +12670,7 @@
 </file>
 
 <file path=word/numbering.xml><?xml version="1.0" encoding="utf-8"?>
-<w:numbering xmlns:wpc="http://schemas.microsoft.com/office/word/2010/wordprocessingCanvas" xmlns:cx="http://schemas.microsoft.com/office/drawing/2014/chartex" xmlns:cx1="http://schemas.microsoft.com/office/drawing/2015/9/8/chartex" xmlns:cx2="http://schemas.microsoft.com/office/drawing/2015/10/21/chartex" xmlns:cx3="http://schemas.microsoft.com/office/drawing/2016/5/9/chartex" xmlns:cx4="http://schemas.microsoft.com/office/drawing/2016/5/10/chartex" xmlns:cx5="http://schemas.microsoft.com/office/drawing/2016/5/11/chartex" xmlns:cx6="http://schemas.microsoft.com/office/drawing/2016/5/12/chartex" xmlns:cx7="http://schemas.microsoft.com/office/drawing/2016/5/13/chartex" xmlns:cx8="http://schemas.microsoft.com/office/drawing/2016/5/14/chartex" xmlns:mc="http://schemas.openxmlformats.org/markup-compatibility/2006" xmlns:aink="http://schemas.microsoft.com/office/drawing/2016/ink" xmlns:am3d="http://schemas.microsoft.com/office/drawing/2017/model3d" xmlns:o="urn:schemas-microsoft-com:office:office" xmlns:oel="http://schemas.microsoft.com/office/2019/extlst" xmlns:r="http://schemas.openxmlformats.org/officeDocument/2006/relationships" xmlns:m="http://schemas.openxmlformats.org/officeDocument/2006/math" xmlns:v="urn:schemas-microsoft-com:vml" xmlns:wp14="http://schemas.microsoft.com/office/word/2010/wordprocessingDrawing" xmlns:wp="http://schemas.openxmlformats.org/drawingml/2006/wordprocessingDrawing" xmlns:w10="urn:schemas-microsoft-com:office:word" xmlns:w="http://schemas.openxmlformats.org/wordprocessingml/2006/main" xmlns:w14="http://schemas.microsoft.com/office/word/2010/wordml" xmlns:w15="http://schemas.microsoft.com/office/word/2012/wordml" xmlns:w16cex="http://schemas.microsoft.com/office/word/2018/wordml/cex" xmlns:w16cid="http://schemas.microsoft.com/office/word/2016/wordml/cid" xmlns:w16="http://schemas.microsoft.com/office/word/2018/wordml" xmlns:w16du="http://schemas.microsoft.com/office/word/2023/wordml/word16du" xmlns:w16sdtdh="http://schemas.microsoft.com/office/word/2020/wordml/sdtdatahash" xmlns:w16sdtfl="http://schemas.microsoft.com/office/word/2024/wordml/sdtformatlock" xmlns:w16se="http://schemas.microsoft.com/office/word/2015/wordml/symex" xmlns:wpg="http://schemas.microsoft.com/office/word/2010/wordprocessingGroup" xmlns:wpi="http://schemas.microsoft.com/office/word/2010/wordprocessingInk" xmlns:wne="http://schemas.microsoft.com/office/word/2006/wordml" xmlns:wps="http://schemas.microsoft.com/office/word/2010/wordprocessingShape" mc:Ignorable="w14 w15 w16se w16cid w16 w16cex w16sdtdh w16sdtfl w16du wp14">
+<w:numbering xmlns:wpc="http://schemas.microsoft.com/office/word/2010/wordprocessingCanvas" xmlns:cx="http://schemas.microsoft.com/office/drawing/2014/chartex" xmlns:cx1="http://schemas.microsoft.com/office/drawing/2015/9/8/chartex" xmlns:cx2="http://schemas.microsoft.com/office/drawing/2015/10/21/chartex" xmlns:cx3="http://schemas.microsoft.com/office/drawing/2016/5/9/chartex" xmlns:cx4="http://schemas.microsoft.com/office/drawing/2016/5/10/chartex" xmlns:cx5="http://schemas.microsoft.com/office/drawing/2016/5/11/chartex" xmlns:cx6="http://schemas.microsoft.com/office/drawing/2016/5/12/chartex" xmlns:cx7="http://schemas.microsoft.com/office/drawing/2016/5/13/chartex" xmlns:cx8="http://schemas.microsoft.com/office/drawing/2016/5/14/chartex" xmlns:mc="http://schemas.openxmlformats.org/markup-compatibility/2006" xmlns:aink="http://schemas.microsoft.com/office/drawing/2016/ink" xmlns:am3d="http://schemas.microsoft.com/office/drawing/2017/model3d" xmlns:o="urn:schemas-microsoft-com:office:office" xmlns:oel="http://schemas.microsoft.com/office/2019/extlst" xmlns:r="http://schemas.openxmlformats.org/officeDocument/2006/relationships" xmlns:m="http://schemas.openxmlformats.org/officeDocument/2006/math" xmlns:v="urn:schemas-microsoft-com:vml" xmlns:wp14="http://schemas.microsoft.com/office/word/2010/wordprocessingDrawing" xmlns:wp="http://schemas.openxmlformats.org/drawingml/2006/wordprocessingDrawing" xmlns:w10="urn:schemas-microsoft-com:office:word" xmlns:w="http://schemas.openxmlformats.org/wordprocessingml/2006/main" xmlns:w14="http://schemas.microsoft.com/office/word/2010/wordml" xmlns:w15="http://schemas.microsoft.com/office/word/2012/wordml" xmlns:w16cex="http://schemas.microsoft.com/office/word/2018/wordml/cex" xmlns:w16cid="http://schemas.microsoft.com/office/word/2016/wordml/cid" xmlns:w16="http://schemas.microsoft.com/office/word/2018/wordml" xmlns:w16du="http://schemas.microsoft.com/office/word/2023/wordml/word16du" xmlns:w16sdtdh="http://schemas.microsoft.com/office/word/2020/wordml/sdtdatahash" xmlns:w16se="http://schemas.microsoft.com/office/word/2015/wordml/symex" xmlns:wpg="http://schemas.microsoft.com/office/word/2010/wordprocessingGroup" xmlns:wpi="http://schemas.microsoft.com/office/word/2010/wordprocessingInk" xmlns:wne="http://schemas.microsoft.com/office/word/2006/wordml" xmlns:wps="http://schemas.microsoft.com/office/word/2010/wordprocessingShape" mc:Ignorable="w14 w15 w16se w16cid w16 w16cex w16sdtdh wp14">
   <w:abstractNum w:abstractNumId="0" w15:restartNumberingAfterBreak="0">
     <w:nsid w:val="0E713291"/>
     <w:multiLevelType w:val="multilevel"/>
@@ -14140,7 +14431,7 @@
 </file>
 
 <file path=word/styles.xml><?xml version="1.0" encoding="utf-8"?>
-<w:styles xmlns:mc="http://schemas.openxmlformats.org/markup-compatibility/2006" xmlns:r="http://schemas.openxmlformats.org/officeDocument/2006/relationships" xmlns:w="http://schemas.openxmlformats.org/wordprocessingml/2006/main" xmlns:w14="http://schemas.microsoft.com/office/word/2010/wordml" xmlns:w15="http://schemas.microsoft.com/office/word/2012/wordml" xmlns:w16cex="http://schemas.microsoft.com/office/word/2018/wordml/cex" xmlns:w16cid="http://schemas.microsoft.com/office/word/2016/wordml/cid" xmlns:w16="http://schemas.microsoft.com/office/word/2018/wordml" xmlns:w16du="http://schemas.microsoft.com/office/word/2023/wordml/word16du" xmlns:w16sdtdh="http://schemas.microsoft.com/office/word/2020/wordml/sdtdatahash" xmlns:w16sdtfl="http://schemas.microsoft.com/office/word/2024/wordml/sdtformatlock" xmlns:w16se="http://schemas.microsoft.com/office/word/2015/wordml/symex" mc:Ignorable="w14 w15 w16se w16cid w16 w16cex w16sdtdh w16sdtfl w16du">
+<w:styles xmlns:mc="http://schemas.openxmlformats.org/markup-compatibility/2006" xmlns:r="http://schemas.openxmlformats.org/officeDocument/2006/relationships" xmlns:w="http://schemas.openxmlformats.org/wordprocessingml/2006/main" xmlns:w14="http://schemas.microsoft.com/office/word/2010/wordml" xmlns:w15="http://schemas.microsoft.com/office/word/2012/wordml" xmlns:w16cex="http://schemas.microsoft.com/office/word/2018/wordml/cex" xmlns:w16cid="http://schemas.microsoft.com/office/word/2016/wordml/cid" xmlns:w16="http://schemas.microsoft.com/office/word/2018/wordml" xmlns:w16sdtdh="http://schemas.microsoft.com/office/word/2020/wordml/sdtdatahash" xmlns:w16se="http://schemas.microsoft.com/office/word/2015/wordml/symex" mc:Ignorable="w14 w15 w16se w16cid w16 w16cex w16sdtdh">
   <w:docDefaults>
     <w:rPrDefault>
       <w:rPr>

</xml_diff>